<commit_message>
feat: add Facebook CAPI lead tracking fields, sync actions, and log views
</commit_message>
<xml_diff>
--- a/meta_lead_connector_features.docx
+++ b/meta_lead_connector_features.docx
@@ -214,6 +214,1183 @@
         <w:t>Leads are fetched manually via buttons; there are no webhooks or automatic schedulers active. Deployment is via Docker Compose with Odoo 19 and PostgreSQL.</w:t>
       </w:r>
     </w:p>
+    <w:p>
+      <w:pPr>
+        <w:pStyle w:val="Heading1"/>
+      </w:pPr>
+      <w:r>
+        <w:t>Meta Permissions Required</w:t>
+      </w:r>
+    </w:p>
+    <w:p>
+      <w:r>
+        <w:t>Permissions (scopes) the Meta app / token must carry for this module to work. Grant them on the Meta app (Dashboard &gt; App Review &gt; Permissions and Features) and tick them when generating the token.</w:t>
+      </w:r>
+    </w:p>
+    <w:tbl>
+      <w:tblPr>
+        <w:tblStyle w:val="TableGrid"/>
+        <w:tblW w:type="auto" w:w="0"/>
+        <w:tblLook w:firstColumn="1" w:firstRow="1" w:lastColumn="0" w:lastRow="0" w:noHBand="0" w:noVBand="1" w:val="04A0"/>
+      </w:tblPr>
+      <w:tblGrid>
+        <w:gridCol w:w="2160"/>
+        <w:gridCol w:w="2160"/>
+        <w:gridCol w:w="2160"/>
+        <w:gridCol w:w="2160"/>
+        <w:gridCol w:w="1500"/>
+      </w:tblGrid>
+      <w:tr>
+        <w:tc>
+          <w:tcPr>
+            <w:tcW w:type="dxa" w:w="2160"/>
+          </w:tcPr>
+          <w:p>
+            <w:r>
+              <w:rPr>
+                <w:b/>
+              </w:rPr>
+              <w:t>Permission</w:t>
+            </w:r>
+          </w:p>
+        </w:tc>
+        <w:tc>
+          <w:tcPr>
+            <w:tcW w:type="dxa" w:w="2160"/>
+          </w:tcPr>
+          <w:p>
+            <w:r>
+              <w:rPr>
+                <w:b/>
+              </w:rPr>
+              <w:t>What it unlocks</w:t>
+            </w:r>
+          </w:p>
+        </w:tc>
+        <w:tc>
+          <w:tcPr>
+            <w:tcW w:type="dxa" w:w="2160"/>
+          </w:tcPr>
+          <w:p>
+            <w:r>
+              <w:rPr>
+                <w:b/>
+              </w:rPr>
+              <w:t>Graph API call</w:t>
+            </w:r>
+          </w:p>
+        </w:tc>
+        <w:tc>
+          <w:tcPr>
+            <w:tcW w:type="dxa" w:w="2160"/>
+          </w:tcPr>
+          <w:p>
+            <w:r>
+              <w:rPr>
+                <w:b/>
+              </w:rPr>
+              <w:t>Notes</w:t>
+            </w:r>
+          </w:p>
+        </w:tc>
+        <w:tc>
+          <w:tcPr>
+            <w:tcW w:w="1500" w:type="dxa"/>
+          </w:tcPr>
+          <w:p>
+            <w:r>
+              <w:rPr>
+                <w:b/>
+              </w:rPr>
+              <w:t xml:space="preserve">Required?</w:t>
+            </w:r>
+          </w:p>
+        </w:tc>
+      </w:tr>
+      <w:tr>
+        <w:tc>
+          <w:tcPr>
+            <w:tcW w:type="dxa" w:w="2160"/>
+          </w:tcPr>
+          <w:p>
+            <w:r>
+              <w:t>leads_retrieval</w:t>
+            </w:r>
+          </w:p>
+        </w:tc>
+        <w:tc>
+          <w:tcPr>
+            <w:tcW w:type="dxa" w:w="2160"/>
+          </w:tcPr>
+          <w:p>
+            <w:r>
+              <w:t>Read lead submissions</w:t>
+            </w:r>
+          </w:p>
+        </w:tc>
+        <w:tc>
+          <w:tcPr>
+            <w:tcW w:type="dxa" w:w="2160"/>
+          </w:tcPr>
+          <w:p>
+            <w:r>
+              <w:t>GET /{form_id}/leads</w:t>
+            </w:r>
+          </w:p>
+        </w:tc>
+        <w:tc>
+          <w:tcPr>
+            <w:tcW w:type="dxa" w:w="2160"/>
+          </w:tcPr>
+          <w:p>
+            <w:r>
+              <w:t>Core permission. Missing leads to API error #10 (insufficient privileges).</w:t>
+            </w:r>
+          </w:p>
+        </w:tc>
+        <w:tc>
+          <w:tcPr>
+            <w:tcW w:w="1500" w:type="dxa"/>
+          </w:tcPr>
+          <w:p>
+            <w:r>
+              <w:t>Required</w:t>
+            </w:r>
+          </w:p>
+        </w:tc>
+      </w:tr>
+      <w:tr>
+        <w:tc>
+          <w:tcPr>
+            <w:tcW w:type="dxa" w:w="2160"/>
+          </w:tcPr>
+          <w:p>
+            <w:r>
+              <w:t>pages_show_list</w:t>
+            </w:r>
+          </w:p>
+        </w:tc>
+        <w:tc>
+          <w:tcPr>
+            <w:tcW w:type="dxa" w:w="2160"/>
+          </w:tcPr>
+          <w:p>
+            <w:r>
+              <w:t>List the pages of the token owner</w:t>
+            </w:r>
+          </w:p>
+        </w:tc>
+        <w:tc>
+          <w:tcPr>
+            <w:tcW w:type="dxa" w:w="2160"/>
+          </w:tcPr>
+          <w:p>
+            <w:r>
+              <w:t>GET /me/accounts</w:t>
+            </w:r>
+          </w:p>
+        </w:tc>
+        <w:tc>
+          <w:tcPr>
+            <w:tcW w:type="dxa" w:w="2160"/>
+          </w:tcPr>
+          <w:p>
+            <w:r>
+              <w:t>Needed for automatic page discovery on "Sync Facebook Page".</w:t>
+            </w:r>
+          </w:p>
+        </w:tc>
+        <w:tc>
+          <w:tcPr>
+            <w:tcW w:w="1500" w:type="dxa"/>
+          </w:tcPr>
+          <w:p>
+            <w:r>
+              <w:t xml:space="preserve">Required</w:t>
+            </w:r>
+          </w:p>
+        </w:tc>
+      </w:tr>
+      <w:tr>
+        <w:tc>
+          <w:tcPr>
+            <w:tcW w:type="dxa" w:w="2160"/>
+          </w:tcPr>
+          <w:p>
+            <w:r>
+              <w:t>pages_read_engagement</w:t>
+            </w:r>
+          </w:p>
+        </w:tc>
+        <w:tc>
+          <w:tcPr>
+            <w:tcW w:type="dxa" w:w="2160"/>
+          </w:tcPr>
+          <w:p>
+            <w:r>
+              <w:t>Read lead forms and form questions</w:t>
+            </w:r>
+          </w:p>
+        </w:tc>
+        <w:tc>
+          <w:tcPr>
+            <w:tcW w:type="dxa" w:w="2160"/>
+          </w:tcPr>
+          <w:p>
+            <w:r>
+              <w:t>GET /{page_id}/leadgen_forms, GET /{form_id}?fields=questions</w:t>
+            </w:r>
+          </w:p>
+        </w:tc>
+        <w:tc>
+          <w:tcPr>
+            <w:tcW w:type="dxa" w:w="2160"/>
+          </w:tcPr>
+          <w:p>
+            <w:r>
+              <w:t>Reads form name/status/created_time and the form questions.</w:t>
+            </w:r>
+          </w:p>
+        </w:tc>
+        <w:tc>
+          <w:tcPr>
+            <w:tcW w:w="1500" w:type="dxa"/>
+          </w:tcPr>
+          <w:p>
+            <w:r>
+              <w:t xml:space="preserve">Required</w:t>
+            </w:r>
+          </w:p>
+        </w:tc>
+      </w:tr>
+      <w:tr>
+        <w:tc>
+          <w:tcPr>
+            <w:tcW w:type="dxa" w:w="2160"/>
+          </w:tcPr>
+          <w:p>
+            <w:r>
+              <w:t>pages_manage_metadata</w:t>
+            </w:r>
+          </w:p>
+        </w:tc>
+        <w:tc>
+          <w:tcPr>
+            <w:tcW w:type="dxa" w:w="2160"/>
+          </w:tcPr>
+          <w:p>
+            <w:r>
+              <w:t>Manage page metadata / page access token</w:t>
+            </w:r>
+          </w:p>
+        </w:tc>
+        <w:tc>
+          <w:tcPr>
+            <w:tcW w:type="dxa" w:w="2160"/>
+          </w:tcPr>
+          <w:p>
+            <w:r>
+              <w:t>Page Access Token exchange</w:t>
+            </w:r>
+          </w:p>
+        </w:tc>
+        <w:tc>
+          <w:tcPr>
+            <w:tcW w:type="dxa" w:w="2160"/>
+          </w:tcPr>
+          <w:p>
+            <w:r>
+              <w:t>Tied to the Page asset being granted "Full control" (Manage page).</w:t>
+            </w:r>
+          </w:p>
+        </w:tc>
+        <w:tc>
+          <w:tcPr>
+            <w:tcW w:w="1500" w:type="dxa"/>
+          </w:tcPr>
+          <w:p>
+            <w:r>
+              <w:t xml:space="preserve">Optional</w:t>
+            </w:r>
+          </w:p>
+        </w:tc>
+      </w:tr>
+      <w:tr>
+        <w:tc>
+          <w:tcPr>
+            <w:tcW w:type="dxa" w:w="2160"/>
+          </w:tcPr>
+          <w:p>
+            <w:r>
+              <w:t>pages_manage_ads</w:t>
+            </w:r>
+          </w:p>
+        </w:tc>
+        <w:tc>
+          <w:tcPr>
+            <w:tcW w:type="dxa" w:w="2160"/>
+          </w:tcPr>
+          <w:p>
+            <w:r>
+              <w:t>Access forms/leads on ad-managed pages</w:t>
+            </w:r>
+          </w:p>
+        </w:tc>
+        <w:tc>
+          <w:tcPr>
+            <w:tcW w:type="dxa" w:w="2160"/>
+          </w:tcPr>
+          <w:p>
+            <w:r>
+              <w:t>GET /{page_id}/leadgen_forms, GET /{form_id}/leads</w:t>
+            </w:r>
+          </w:p>
+        </w:tc>
+        <w:tc>
+          <w:tcPr>
+            <w:tcW w:type="dxa" w:w="2160"/>
+          </w:tcPr>
+          <w:p>
+            <w:r>
+              <w:t>Typically required together with leads_retrieval via Page full control.</w:t>
+            </w:r>
+          </w:p>
+        </w:tc>
+        <w:tc>
+          <w:tcPr>
+            <w:tcW w:w="1500" w:type="dxa"/>
+          </w:tcPr>
+          <w:p>
+            <w:r>
+              <w:t xml:space="preserve">Required*</w:t>
+            </w:r>
+          </w:p>
+        </w:tc>
+      </w:tr>
+      <w:tr>
+        <w:tc>
+          <w:tcPr>
+            <w:tcW w:type="dxa" w:w="2160"/>
+          </w:tcPr>
+          <w:p>
+            <w:r>
+              <w:t>ads_management</w:t>
+            </w:r>
+          </w:p>
+        </w:tc>
+        <w:tc>
+          <w:tcPr>
+            <w:tcW w:type="dxa" w:w="2160"/>
+          </w:tcPr>
+          <w:p>
+            <w:r>
+              <w:t>Read dataset metadata and CAPI access</w:t>
+            </w:r>
+          </w:p>
+        </w:tc>
+        <w:tc>
+          <w:tcPr>
+            <w:tcW w:type="dxa" w:w="2160"/>
+          </w:tcPr>
+          <w:p>
+            <w:r>
+              <w:t>GET /{dataset_id}, POST /{dataset_id}/events</w:t>
+            </w:r>
+          </w:p>
+        </w:tc>
+        <w:tc>
+          <w:tcPr>
+            <w:tcW w:type="dxa" w:w="2160"/>
+          </w:tcPr>
+          <w:p>
+            <w:r>
+              <w:t>Required only for the CAPI connection test (action_test_capi_connection).</w:t>
+            </w:r>
+          </w:p>
+        </w:tc>
+        <w:tc>
+          <w:tcPr>
+            <w:tcW w:w="1500" w:type="dxa"/>
+          </w:tcPr>
+          <w:p>
+            <w:r>
+              <w:t xml:space="preserve">Optional (CAPI only)</w:t>
+            </w:r>
+          </w:p>
+        </w:tc>
+      </w:tr>
+      <w:tr>
+        <w:tc>
+          <w:tcPr>
+            <w:tcW w:type="dxa" w:w="2160"/>
+          </w:tcPr>
+          <w:p>
+            <w:r>
+              <w:t>business_management</w:t>
+            </w:r>
+          </w:p>
+        </w:tc>
+        <w:tc>
+          <w:tcPr>
+            <w:tcW w:type="dxa" w:w="2160"/>
+          </w:tcPr>
+          <w:p>
+            <w:r>
+              <w:t>Discover the business assets (System Users)</w:t>
+            </w:r>
+          </w:p>
+        </w:tc>
+        <w:tc>
+          <w:tcPr>
+            <w:tcW w:type="dxa" w:w="2160"/>
+          </w:tcPr>
+          <w:p>
+            <w:r>
+              <w:t>GET /me/businesses, GET /{business_id}/owned_pages</w:t>
+            </w:r>
+          </w:p>
+        </w:tc>
+        <w:tc>
+          <w:tcPr>
+            <w:tcW w:type="dxa" w:w="2160"/>
+          </w:tcPr>
+          <w:p>
+            <w:r>
+              <w:t>Required when using a Business Manager System User token (see note below).</w:t>
+            </w:r>
+          </w:p>
+        </w:tc>
+        <w:tc>
+          <w:tcPr>
+            <w:tcW w:w="1500" w:type="dxa"/>
+          </w:tcPr>
+          <w:p>
+            <w:r>
+              <w:t xml:space="preserve">Required (System User tokens)</w:t>
+            </w:r>
+          </w:p>
+        </w:tc>
+      </w:tr>
+      <w:tr>
+        <w:tc>
+          <w:tcPr>
+            <w:tcW w:type="dxa" w:w="2160"/>
+          </w:tcPr>
+          <w:p>
+            <w:r>
+              <w:t>public_profile</w:t>
+            </w:r>
+          </w:p>
+        </w:tc>
+        <w:tc>
+          <w:tcPr>
+            <w:tcW w:type="dxa" w:w="2160"/>
+          </w:tcPr>
+          <w:p>
+            <w:r>
+              <w:t>Basic identity of the token owner</w:t>
+            </w:r>
+          </w:p>
+        </w:tc>
+        <w:tc>
+          <w:tcPr>
+            <w:tcW w:type="dxa" w:w="2160"/>
+          </w:tcPr>
+          <w:p>
+            <w:r>
+              <w:t>GET /me</w:t>
+            </w:r>
+          </w:p>
+        </w:tc>
+        <w:tc>
+          <w:tcPr>
+            <w:tcW w:type="dxa" w:w="2160"/>
+          </w:tcPr>
+          <w:p>
+            <w:r>
+              <w:t>Automatically granted; used for identity checks.</w:t>
+            </w:r>
+          </w:p>
+        </w:tc>
+        <w:tc>
+          <w:tcPr>
+            <w:tcW w:w="1500" w:type="dxa"/>
+          </w:tcPr>
+          <w:p>
+            <w:r>
+              <w:t xml:space="preserve">Optional (auto-granted)</w:t>
+            </w:r>
+          </w:p>
+        </w:tc>
+      </w:tr>
+    </w:tbl>
+    <w:p>
+      <w:r>
+        <w:rPr>
+          <w:i/>
+          <w:sz w:val="20"/>
+        </w:rPr>
+        <w:t>Legend: pages_manage_ads marked Required* is recommended together with leads_retrieval (via Page "Full control") for lead forms/leads on ad-managed pages.</w:t>
+      </w:r>
+    </w:p>
+    <w:p>
+      <w:r>
+        <w:rPr>
+          <w:b/>
+        </w:rPr>
+        <w:t xml:space="preserve">Token type matters. </w:t>
+      </w:r>
+      <w:r>
+        <w:t>A personal User Access Token lists pages via GET /me/accounts. A Business Manager System User token returns data: [] from GET /me/accounts; pages must be discovered via GET /me/businesses + GET /{business_id}/owned_pages, which requires the business_management permission.</w:t>
+      </w:r>
+    </w:p>
+    <w:p>
+      <w:pPr>
+        <w:pStyle w:val="Heading1"/>
+      </w:pPr>
+      <w:r>
+        <w:t>Graph API Endpoint Reference</w:t>
+      </w:r>
+    </w:p>
+    <w:p>
+      <w:r>
+        <w:t>All endpoints use the base URL https://graph.facebook.com/v25.0 (FB_API constant) and pass the token as the access_token query parameter. Use a Page Access Token for page- and form-level endpoints; use the User / System User token for /me endpoints.</w:t>
+      </w:r>
+    </w:p>
+    <w:tbl>
+      <w:tblPr>
+        <w:tblStyle w:val="TableGrid"/>
+        <w:tblW w:type="auto" w:w="0"/>
+        <w:tblLook w:firstColumn="1" w:firstRow="1" w:lastColumn="0" w:lastRow="0" w:noHBand="0" w:noVBand="1" w:val="04A0"/>
+      </w:tblPr>
+      <w:tblGrid>
+        <w:gridCol w:w="1728"/>
+        <w:gridCol w:w="1728"/>
+        <w:gridCol w:w="1728"/>
+        <w:gridCol w:w="1728"/>
+        <w:gridCol w:w="1728"/>
+      </w:tblGrid>
+      <w:tr>
+        <w:tc>
+          <w:tcPr>
+            <w:tcW w:type="dxa" w:w="1728"/>
+          </w:tcPr>
+          <w:p>
+            <w:r>
+              <w:rPr>
+                <w:b/>
+              </w:rPr>
+              <w:t>Endpoint</w:t>
+            </w:r>
+          </w:p>
+        </w:tc>
+        <w:tc>
+          <w:tcPr>
+            <w:tcW w:type="dxa" w:w="1728"/>
+          </w:tcPr>
+          <w:p>
+            <w:r>
+              <w:rPr>
+                <w:b/>
+              </w:rPr>
+              <w:t>Method</w:t>
+            </w:r>
+          </w:p>
+        </w:tc>
+        <w:tc>
+          <w:tcPr>
+            <w:tcW w:type="dxa" w:w="1728"/>
+          </w:tcPr>
+          <w:p>
+            <w:r>
+              <w:rPr>
+                <w:b/>
+              </w:rPr>
+              <w:t>Model / Function</w:t>
+            </w:r>
+          </w:p>
+        </w:tc>
+        <w:tc>
+          <w:tcPr>
+            <w:tcW w:type="dxa" w:w="1728"/>
+          </w:tcPr>
+          <w:p>
+            <w:r>
+              <w:rPr>
+                <w:b/>
+              </w:rPr>
+              <w:t>Purpose</w:t>
+            </w:r>
+          </w:p>
+        </w:tc>
+        <w:tc>
+          <w:tcPr>
+            <w:tcW w:type="dxa" w:w="1728"/>
+          </w:tcPr>
+          <w:p>
+            <w:r>
+              <w:rPr>
+                <w:b/>
+              </w:rPr>
+              <w:t>Pagination / Error handling</w:t>
+            </w:r>
+          </w:p>
+        </w:tc>
+      </w:tr>
+      <w:tr>
+        <w:tc>
+          <w:tcPr>
+            <w:tcW w:type="dxa" w:w="1728"/>
+          </w:tcPr>
+          <w:p>
+            <w:r>
+              <w:t>/me/accounts (fields=id,name,access_token)</w:t>
+            </w:r>
+          </w:p>
+        </w:tc>
+        <w:tc>
+          <w:tcPr>
+            <w:tcW w:type="dxa" w:w="1728"/>
+          </w:tcPr>
+          <w:p>
+            <w:r>
+              <w:t>GET</w:t>
+            </w:r>
+          </w:p>
+        </w:tc>
+        <w:tc>
+          <w:tcPr>
+            <w:tcW w:type="dxa" w:w="1728"/>
+          </w:tcPr>
+          <w:p>
+            <w:r>
+              <w:t>facebook.instance.action_sync_facebook_pages (models/token.py:51)</w:t>
+            </w:r>
+          </w:p>
+        </w:tc>
+        <w:tc>
+          <w:tcPr>
+            <w:tcW w:type="dxa" w:w="1728"/>
+          </w:tcPr>
+          <w:p>
+            <w:r>
+              <w:t>Discover the pages of the User token; creates/updates facebook.page records with the page access token.</w:t>
+            </w:r>
+          </w:p>
+        </w:tc>
+        <w:tc>
+          <w:tcPr>
+            <w:tcW w:type="dxa" w:w="1728"/>
+          </w:tcPr>
+          <w:p>
+            <w:r>
+              <w:t>No paging loop (first page of results only).</w:t>
+            </w:r>
+          </w:p>
+        </w:tc>
+      </w:tr>
+      <w:tr>
+        <w:tc>
+          <w:tcPr>
+            <w:tcW w:type="dxa" w:w="1728"/>
+          </w:tcPr>
+          <w:p>
+            <w:r>
+              <w:t>/{page_id}/leadgen_forms (fields=id,name,status,created_time,leads_count)</w:t>
+            </w:r>
+          </w:p>
+        </w:tc>
+        <w:tc>
+          <w:tcPr>
+            <w:tcW w:type="dxa" w:w="1728"/>
+          </w:tcPr>
+          <w:p>
+            <w:r>
+              <w:t>GET</w:t>
+            </w:r>
+          </w:p>
+        </w:tc>
+        <w:tc>
+          <w:tcPr>
+            <w:tcW w:type="dxa" w:w="1728"/>
+          </w:tcPr>
+          <w:p>
+            <w:r>
+              <w:t>crm.facebook.campaign.action_fetch_leadforms (models/lead.py:58)</w:t>
+            </w:r>
+          </w:p>
+        </w:tc>
+        <w:tc>
+          <w:tcPr>
+            <w:tcW w:type="dxa" w:w="1728"/>
+          </w:tcPr>
+          <w:p>
+            <w:r>
+              <w:t>List the lead forms of a page; creates campaigns (crm.facebook.campaign) and lead form records.</w:t>
+            </w:r>
+          </w:p>
+        </w:tc>
+        <w:tc>
+          <w:tcPr>
+            <w:tcW w:type="dxa" w:w="1728"/>
+          </w:tcPr>
+          <w:p>
+            <w:r>
+              <w:t>Follows paging.next until exhausted.</w:t>
+            </w:r>
+          </w:p>
+        </w:tc>
+      </w:tr>
+      <w:tr>
+        <w:tc>
+          <w:tcPr>
+            <w:tcW w:type="dxa" w:w="1728"/>
+          </w:tcPr>
+          <w:p>
+            <w:r>
+              <w:t>/{form_id} (fields=questions)</w:t>
+            </w:r>
+          </w:p>
+        </w:tc>
+        <w:tc>
+          <w:tcPr>
+            <w:tcW w:type="dxa" w:w="1728"/>
+          </w:tcPr>
+          <w:p>
+            <w:r>
+              <w:t>GET</w:t>
+            </w:r>
+          </w:p>
+        </w:tc>
+        <w:tc>
+          <w:tcPr>
+            <w:tcW w:type="dxa" w:w="1728"/>
+          </w:tcPr>
+          <w:p>
+            <w:r>
+              <w:t>crm.facebook.leadform.action_import_fields (models/lead.py:184)</w:t>
+            </w:r>
+          </w:p>
+        </w:tc>
+        <w:tc>
+          <w:tcPr>
+            <w:tcW w:type="dxa" w:w="1728"/>
+          </w:tcPr>
+          <w:p>
+            <w:r>
+              <w:t>Load the questions of a form into the field mapping lines.</w:t>
+            </w:r>
+          </w:p>
+        </w:tc>
+        <w:tc>
+          <w:tcPr>
+            <w:tcW w:type="dxa" w:w="1728"/>
+          </w:tcPr>
+          <w:p>
+            <w:r>
+              <w:t>Errors surfaced as UserError with the Facebook message.</w:t>
+            </w:r>
+          </w:p>
+        </w:tc>
+      </w:tr>
+      <w:tr>
+        <w:tc>
+          <w:tcPr>
+            <w:tcW w:type="dxa" w:w="1728"/>
+          </w:tcPr>
+          <w:p>
+            <w:r>
+              <w:t>/{form_id}/leads (fields=id,created_time,field_data + limit + filtering)</w:t>
+            </w:r>
+          </w:p>
+        </w:tc>
+        <w:tc>
+          <w:tcPr>
+            <w:tcW w:type="dxa" w:w="1728"/>
+          </w:tcPr>
+          <w:p>
+            <w:r>
+              <w:t>GET</w:t>
+            </w:r>
+          </w:p>
+        </w:tc>
+        <w:tc>
+          <w:tcPr>
+            <w:tcW w:type="dxa" w:w="1728"/>
+          </w:tcPr>
+          <w:p>
+            <w:r>
+              <w:t>crm.facebook.leadform.action_fetch_leads (models/lead.py:263)</w:t>
+            </w:r>
+          </w:p>
+        </w:tc>
+        <w:tc>
+          <w:tcPr>
+            <w:tcW w:type="dxa" w:w="1728"/>
+          </w:tcPr>
+          <w:p>
+            <w:r>
+              <w:t>Fetch lead submissions and write them into crm.lead with deduplication.</w:t>
+            </w:r>
+          </w:p>
+        </w:tc>
+        <w:tc>
+          <w:tcPr>
+            <w:tcW w:type="dxa" w:w="1728"/>
+          </w:tcPr>
+          <w:p>
+            <w:r>
+              <w:t>Follows paging.next; incremental filtering by last_sync_date; handles error codes #10 and #190.</w:t>
+            </w:r>
+          </w:p>
+        </w:tc>
+      </w:tr>
+      <w:tr>
+        <w:tc>
+          <w:tcPr>
+            <w:tcW w:type="dxa" w:w="1728"/>
+          </w:tcPr>
+          <w:p>
+            <w:r>
+              <w:t>/debug_token (input_token)</w:t>
+            </w:r>
+          </w:p>
+        </w:tc>
+        <w:tc>
+          <w:tcPr>
+            <w:tcW w:type="dxa" w:w="1728"/>
+          </w:tcPr>
+          <w:p>
+            <w:r>
+              <w:t>GET</w:t>
+            </w:r>
+          </w:p>
+        </w:tc>
+        <w:tc>
+          <w:tcPr>
+            <w:tcW w:type="dxa" w:w="1728"/>
+          </w:tcPr>
+          <w:p>
+            <w:r>
+              <w:t>(diagnostics)</w:t>
+            </w:r>
+          </w:p>
+        </w:tc>
+        <w:tc>
+          <w:tcPr>
+            <w:tcW w:type="dxa" w:w="1728"/>
+          </w:tcPr>
+          <w:p>
+            <w:r>
+              <w:t>Verify token type, validity, expiry and granted scopes.</w:t>
+            </w:r>
+          </w:p>
+        </w:tc>
+        <w:tc>
+          <w:tcPr>
+            <w:tcW w:type="dxa" w:w="1728"/>
+          </w:tcPr>
+          <w:p>
+            <w:r>
+              <w:t>Used to confirm whether a token is a User or System User token.</w:t>
+            </w:r>
+          </w:p>
+        </w:tc>
+      </w:tr>
+      <w:tr>
+        <w:tc>
+          <w:tcPr>
+            <w:tcW w:type="dxa" w:w="1728"/>
+          </w:tcPr>
+          <w:p>
+            <w:r>
+              <w:t>/{dataset_id} (fields=id,name)</w:t>
+            </w:r>
+          </w:p>
+        </w:tc>
+        <w:tc>
+          <w:tcPr>
+            <w:tcW w:type="dxa" w:w="1728"/>
+          </w:tcPr>
+          <w:p>
+            <w:r>
+              <w:t>GET</w:t>
+            </w:r>
+          </w:p>
+        </w:tc>
+        <w:tc>
+          <w:tcPr>
+            <w:tcW w:type="dxa" w:w="1728"/>
+          </w:tcPr>
+          <w:p>
+            <w:r>
+              <w:t>facebook.instance.action_test_capi_connection (models/token.py:120)</w:t>
+            </w:r>
+          </w:p>
+        </w:tc>
+        <w:tc>
+          <w:tcPr>
+            <w:tcW w:type="dxa" w:w="1728"/>
+          </w:tcPr>
+          <w:p>
+            <w:r>
+              <w:t>CAPI dataset metadata check (requires ads_management).</w:t>
+            </w:r>
+          </w:p>
+        </w:tc>
+        <w:tc>
+          <w:tcPr>
+            <w:tcW w:type="dxa" w:w="1728"/>
+          </w:tcPr>
+          <w:p>
+            <w:r>
+              <w:t>Falls back to the /events test below when metadata is not readable.</w:t>
+            </w:r>
+          </w:p>
+        </w:tc>
+      </w:tr>
+      <w:tr>
+        <w:tc>
+          <w:tcPr>
+            <w:tcW w:type="dxa" w:w="1728"/>
+          </w:tcPr>
+          <w:p>
+            <w:r>
+              <w:t>/{dataset_id}/events</w:t>
+            </w:r>
+          </w:p>
+        </w:tc>
+        <w:tc>
+          <w:tcPr>
+            <w:tcW w:type="dxa" w:w="1728"/>
+          </w:tcPr>
+          <w:p>
+            <w:r>
+              <w:t>POST</w:t>
+            </w:r>
+          </w:p>
+        </w:tc>
+        <w:tc>
+          <w:tcPr>
+            <w:tcW w:type="dxa" w:w="1728"/>
+          </w:tcPr>
+          <w:p>
+            <w:r>
+              <w:t>facebook.instance.action_test_capi_connection (models/token.py:128)</w:t>
+            </w:r>
+          </w:p>
+        </w:tc>
+        <w:tc>
+          <w:tcPr>
+            <w:tcW w:type="dxa" w:w="1728"/>
+          </w:tcPr>
+          <w:p>
+            <w:r>
+              <w:t>CAPI test event validation with a test_event_code.</w:t>
+            </w:r>
+          </w:p>
+        </w:tc>
+        <w:tc>
+          <w:tcPr>
+            <w:tcW w:type="dxa" w:w="1728"/>
+          </w:tcPr>
+          <w:p>
+            <w:r>
+              <w:t>Reports events_received &gt; 0 as a successful connection.</w:t>
+            </w:r>
+          </w:p>
+        </w:tc>
+      </w:tr>
+    </w:tbl>
+    <w:p>
+      <w:pPr>
+        <w:pStyle w:val="Heading2"/>
+      </w:pPr>
+      <w:r>
+        <w:t>Common Facebook API errors</w:t>
+      </w:r>
+    </w:p>
+    <w:tbl>
+      <w:tblPr>
+        <w:tblStyle w:val="TableGrid"/>
+        <w:tblW w:type="auto" w:w="0"/>
+        <w:tblLook w:firstColumn="1" w:firstRow="1" w:lastColumn="0" w:lastRow="0" w:noHBand="0" w:noVBand="1" w:val="04A0"/>
+      </w:tblPr>
+      <w:tblGrid>
+        <w:gridCol w:w="2880"/>
+        <w:gridCol w:w="2880"/>
+        <w:gridCol w:w="2880"/>
+      </w:tblGrid>
+      <w:tr>
+        <w:tc>
+          <w:tcPr>
+            <w:tcW w:type="dxa" w:w="2880"/>
+          </w:tcPr>
+          <w:p>
+            <w:r>
+              <w:rPr>
+                <w:b/>
+              </w:rPr>
+              <w:t>Error code</w:t>
+            </w:r>
+          </w:p>
+        </w:tc>
+        <w:tc>
+          <w:tcPr>
+            <w:tcW w:type="dxa" w:w="2880"/>
+          </w:tcPr>
+          <w:p>
+            <w:r>
+              <w:rPr>
+                <w:b/>
+              </w:rPr>
+              <w:t>Meaning</w:t>
+            </w:r>
+          </w:p>
+        </w:tc>
+        <w:tc>
+          <w:tcPr>
+            <w:tcW w:type="dxa" w:w="2880"/>
+          </w:tcPr>
+          <w:p>
+            <w:r>
+              <w:rPr>
+                <w:b/>
+              </w:rPr>
+              <w:t>Module handling</w:t>
+            </w:r>
+          </w:p>
+        </w:tc>
+      </w:tr>
+      <w:tr>
+        <w:tc>
+          <w:tcPr>
+            <w:tcW w:type="dxa" w:w="2880"/>
+          </w:tcPr>
+          <w:p>
+            <w:r>
+              <w:t>10</w:t>
+            </w:r>
+          </w:p>
+        </w:tc>
+        <w:tc>
+          <w:tcPr>
+            <w:tcW w:type="dxa" w:w="2880"/>
+          </w:tcPr>
+          <w:p>
+            <w:r>
+              <w:t>Insufficient privileges (lead retrieval)</w:t>
+            </w:r>
+          </w:p>
+        </w:tc>
+        <w:tc>
+          <w:tcPr>
+            <w:tcW w:type="dxa" w:w="2880"/>
+          </w:tcPr>
+          <w:p>
+            <w:r>
+              <w:t>models/lead.py:298 - rejects with instruction to grant leads_retrieval and page access.</w:t>
+            </w:r>
+          </w:p>
+        </w:tc>
+      </w:tr>
+      <w:tr>
+        <w:tc>
+          <w:tcPr>
+            <w:tcW w:type="dxa" w:w="2880"/>
+          </w:tcPr>
+          <w:p>
+            <w:r>
+              <w:t>190</w:t>
+            </w:r>
+          </w:p>
+        </w:tc>
+        <w:tc>
+          <w:tcPr>
+            <w:tcW w:type="dxa" w:w="2880"/>
+          </w:tcPr>
+          <w:p>
+            <w:r>
+              <w:t>Access token expired or invalid</w:t>
+            </w:r>
+          </w:p>
+        </w:tc>
+        <w:tc>
+          <w:tcPr>
+            <w:tcW w:type="dxa" w:w="2880"/>
+          </w:tcPr>
+          <w:p>
+            <w:r>
+              <w:t>models/lead.py:302 - tells the user to resync pages / regenerate the token.</w:t>
+            </w:r>
+          </w:p>
+        </w:tc>
+      </w:tr>
+      <w:tr>
+        <w:tc>
+          <w:tcPr>
+            <w:tcW w:type="dxa" w:w="2880"/>
+          </w:tcPr>
+          <w:p>
+            <w:r>
+              <w:t>100</w:t>
+            </w:r>
+          </w:p>
+        </w:tc>
+        <w:tc>
+          <w:tcPr>
+            <w:tcW w:type="dxa" w:w="2880"/>
+          </w:tcPr>
+          <w:p>
+            <w:r>
+              <w:t>Missing permission or invalid parameter</w:t>
+            </w:r>
+          </w:p>
+        </w:tc>
+        <w:tc>
+          <w:tcPr>
+            <w:tcW w:type="dxa" w:w="2880"/>
+          </w:tcPr>
+          <w:p>
+            <w:r>
+              <w:t>Reported with the Facebook error message.</w:t>
+            </w:r>
+          </w:p>
+        </w:tc>
+      </w:tr>
+      <w:tr>
+        <w:tc>
+          <w:tcPr>
+            <w:tcW w:type="dxa" w:w="2880"/>
+          </w:tcPr>
+          <w:p>
+            <w:r>
+              <w:t>200</w:t>
+            </w:r>
+          </w:p>
+        </w:tc>
+        <w:tc>
+          <w:tcPr>
+            <w:tcW w:type="dxa" w:w="2880"/>
+          </w:tcPr>
+          <w:p>
+            <w:r>
+              <w:t>Permission error (scope not granted)</w:t>
+            </w:r>
+          </w:p>
+        </w:tc>
+        <w:tc>
+          <w:tcPr>
+            <w:tcW w:type="dxa" w:w="2880"/>
+          </w:tcPr>
+          <w:p>
+            <w:r>
+              <w:t>Reported with the Facebook error message.</w:t>
+            </w:r>
+          </w:p>
+        </w:tc>
+      </w:tr>
+    </w:tbl>
     <w:sectPr>
       <w:pgSz w:w="12240" w:h="15840"/>
       <w:pgMar w:top="1440" w:right="1800" w:bottom="1440" w:left="1800" w:header="720" w:footer="720" w:gutter="0"/>

</xml_diff>